<commit_message>
Weekly Progress Report 8 under development.
</commit_message>
<xml_diff>
--- a/Weekly Reports/WeeklyProgressReport-GroupB-Week8.docx
+++ b/Weekly Reports/WeeklyProgressReport-GroupB-Week8.docx
@@ -529,8 +529,18 @@
                 <w:b w:val="0"/>
                 <w:color w:val="548DD4" w:themeColor="text2" w:themeTint="99"/>
               </w:rPr>
-              <w:t>William Pourmajidi</w:t>
+              <w:t xml:space="preserve">William </w:t>
             </w:r>
+            <w:proofErr w:type="spellStart"/>
+            <w:r>
+              <w:rPr>
+                <w:rFonts w:cstheme="minorHAnsi"/>
+                <w:b w:val="0"/>
+                <w:color w:val="548DD4" w:themeColor="text2" w:themeTint="99"/>
+              </w:rPr>
+              <w:t>Pourmajidi</w:t>
+            </w:r>
+            <w:proofErr w:type="spellEnd"/>
           </w:p>
         </w:tc>
       </w:tr>
@@ -1141,6 +1151,20 @@
       <w:r>
         <w:t xml:space="preserve"> </w:t>
       </w:r>
+      <w:r>
+        <w:rPr>
+          <w:b w:val="0"/>
+          <w:bCs/>
+        </w:rPr>
+        <w:t>Demonstrated</w:t>
+      </w:r>
+      <w:r>
+        <w:rPr>
+          <w:b w:val="0"/>
+          <w:bCs/>
+        </w:rPr>
+        <w:t xml:space="preserve"> a sample project using GitHub Actions.</w:t>
+      </w:r>
     </w:p>
     <w:p>
       <w:pPr>
@@ -1465,7 +1489,7 @@
           <w:b w:val="0"/>
           <w:szCs w:val="28"/>
         </w:rPr>
-        <w:t xml:space="preserve">do </w:t>
+        <w:t>did</w:t>
       </w:r>
       <w:r>
         <w:rPr>
@@ -1473,6 +1497,14 @@
           <w:b w:val="0"/>
           <w:szCs w:val="28"/>
         </w:rPr>
+        <w:t xml:space="preserve"> </w:t>
+      </w:r>
+      <w:r>
+        <w:rPr>
+          <w:rFonts w:eastAsiaTheme="majorEastAsia" w:cstheme="minorHAnsi"/>
+          <w:b w:val="0"/>
+          <w:szCs w:val="28"/>
+        </w:rPr>
         <w:t xml:space="preserve">not </w:t>
       </w:r>
       <w:r>
@@ -1482,14 +1514,6 @@
           <w:szCs w:val="28"/>
         </w:rPr>
         <w:t>face</w:t>
-      </w:r>
-      <w:r>
-        <w:rPr>
-          <w:rFonts w:eastAsiaTheme="majorEastAsia" w:cstheme="minorHAnsi"/>
-          <w:b w:val="0"/>
-          <w:szCs w:val="28"/>
-        </w:rPr>
-        <w:t>d</w:t>
       </w:r>
       <w:r>
         <w:rPr>
@@ -1813,6 +1837,7 @@
         </w:rPr>
         <w:t>/</w:t>
       </w:r>
+      <w:proofErr w:type="spellStart"/>
       <w:r>
         <w:rPr>
           <w:rFonts w:asciiTheme="minorHAnsi" w:hAnsiTheme="minorHAnsi" w:cstheme="minorHAnsi"/>
@@ -1837,6 +1862,7 @@
         </w:rPr>
         <w:t>ub</w:t>
       </w:r>
+      <w:proofErr w:type="spellEnd"/>
       <w:r>
         <w:rPr>
           <w:rFonts w:asciiTheme="minorHAnsi" w:hAnsiTheme="minorHAnsi" w:cstheme="minorHAnsi"/>
@@ -1853,6 +1879,9 @@
         <w:jc w:val="center"/>
       </w:pPr>
       <w:r>
+        <w:rPr>
+          <w:noProof/>
+        </w:rPr>
         <w:drawing>
           <wp:inline distT="0" distB="0" distL="0" distR="0" wp14:anchorId="2E9A5858" wp14:editId="6ED2CB82">
             <wp:extent cx="5943600" cy="4321810"/>
@@ -2023,7 +2052,43 @@
           <w:bCs w:val="0"/>
         </w:rPr>
         <w:lastRenderedPageBreak/>
-        <w:t>Include charts/graphs (e.g., burn down charts) from your project management tool (Github/Zenhub) that shows your progress for the period of this report.</w:t>
+        <w:t>Include charts/graphs (e.g., burn down charts) from your project management tool (</w:t>
+      </w:r>
+      <w:proofErr w:type="spellStart"/>
+      <w:r>
+        <w:rPr>
+          <w:rFonts w:asciiTheme="minorHAnsi" w:hAnsiTheme="minorHAnsi" w:cstheme="minorHAnsi"/>
+          <w:b/>
+          <w:bCs w:val="0"/>
+        </w:rPr>
+        <w:t>Github</w:t>
+      </w:r>
+      <w:proofErr w:type="spellEnd"/>
+      <w:r>
+        <w:rPr>
+          <w:rFonts w:asciiTheme="minorHAnsi" w:hAnsiTheme="minorHAnsi" w:cstheme="minorHAnsi"/>
+          <w:b/>
+          <w:bCs w:val="0"/>
+        </w:rPr>
+        <w:t>/</w:t>
+      </w:r>
+      <w:proofErr w:type="spellStart"/>
+      <w:r>
+        <w:rPr>
+          <w:rFonts w:asciiTheme="minorHAnsi" w:hAnsiTheme="minorHAnsi" w:cstheme="minorHAnsi"/>
+          <w:b/>
+          <w:bCs w:val="0"/>
+        </w:rPr>
+        <w:t>Zenhub</w:t>
+      </w:r>
+      <w:proofErr w:type="spellEnd"/>
+      <w:r>
+        <w:rPr>
+          <w:rFonts w:asciiTheme="minorHAnsi" w:hAnsiTheme="minorHAnsi" w:cstheme="minorHAnsi"/>
+          <w:b/>
+          <w:bCs w:val="0"/>
+        </w:rPr>
+        <w:t>) that shows your progress for the period of this report.</w:t>
       </w:r>
     </w:p>
     <w:p>
@@ -2032,6 +2097,9 @@
         <w:jc w:val="center"/>
       </w:pPr>
       <w:r>
+        <w:rPr>
+          <w:noProof/>
+        </w:rPr>
         <w:drawing>
           <wp:inline distT="0" distB="0" distL="0" distR="0" wp14:anchorId="75150497" wp14:editId="61B19EB3">
             <wp:extent cx="5943600" cy="5732145"/>
@@ -2414,8 +2482,18 @@
         <w:b w:val="0"/>
         <w:sz w:val="20"/>
       </w:rPr>
-      <w:t>Prepared by William Pourmajidi</w:t>
+      <w:t xml:space="preserve">Prepared by William </w:t>
     </w:r>
+    <w:proofErr w:type="spellStart"/>
+    <w:r>
+      <w:rPr>
+        <w:rFonts w:cstheme="minorHAnsi"/>
+        <w:b w:val="0"/>
+        <w:sz w:val="20"/>
+      </w:rPr>
+      <w:t>Pourmajidi</w:t>
+    </w:r>
+    <w:proofErr w:type="spellEnd"/>
   </w:p>
   <w:p>
     <w:pPr>
@@ -2451,8 +2529,18 @@
         <w:b w:val="0"/>
         <w:sz w:val="20"/>
       </w:rPr>
-      <w:t xml:space="preserve"> Vahid Hadavi</w:t>
+      <w:t xml:space="preserve"> Vahid </w:t>
     </w:r>
+    <w:proofErr w:type="spellStart"/>
+    <w:r>
+      <w:rPr>
+        <w:rFonts w:cstheme="minorHAnsi"/>
+        <w:b w:val="0"/>
+        <w:sz w:val="20"/>
+      </w:rPr>
+      <w:t>Hadavi</w:t>
+    </w:r>
+    <w:proofErr w:type="spellEnd"/>
     <w:r>
       <w:rPr>
         <w:rFonts w:cstheme="minorHAnsi"/>

</xml_diff>